<commit_message>
Auto save docs: WM Montagens Industriais/_qrcodes/nr 20 (08) (WM)_qrcode.png
</commit_message>
<xml_diff>
--- a/WM Montagens Industriais/nr 20 (08) (WM).docx
+++ b/WM Montagens Industriais/nr 20 (08) (WM).docx
@@ -220,7 +220,21 @@
                 <w:sz w:val="26"/>
                 <w:szCs w:val="26"/>
               </w:rPr>
-              <w:t>Obteve aproveitamento satisfatório no curso de capacitação em</w:t>
+              <w:t>Colaborador da empresa1, o</w:t>
+            </w:r>
+            <w:r>
+              <w:rPr>
+                <w:sz w:val="26"/>
+                <w:szCs w:val="26"/>
+              </w:rPr>
+              <w:t xml:space="preserve">bteve </w:t>
+            </w:r>
+            <w:r>
+              <w:rPr>
+                <w:sz w:val="26"/>
+                <w:szCs w:val="26"/>
+              </w:rPr>
+              <w:t>aproveitamento satisfatório no curso de capacitação em</w:t>
             </w:r>
             <w:r>
               <w:rPr>
@@ -245,6 +259,15 @@
                 <w:sz w:val="26"/>
                 <w:szCs w:val="26"/>
               </w:rPr>
+              <w:t xml:space="preserve">NR 20 - </w:t>
+            </w:r>
+            <w:r>
+              <w:rPr>
+                <w:b/>
+                <w:bCs/>
+                <w:sz w:val="26"/>
+                <w:szCs w:val="26"/>
+              </w:rPr>
               <w:t>SEGURANÇA NA OPERAÇÃO DE MÁQUINAS E EQUIPAMENTOS</w:t>
             </w:r>
             <w:r>
@@ -418,28 +441,21 @@
                 <w:sz w:val="26"/>
                 <w:szCs w:val="26"/>
               </w:rPr>
-              <w:t xml:space="preserve"> </w:t>
-            </w:r>
-            <w:r>
-              <w:rPr>
-                <w:sz w:val="26"/>
-                <w:szCs w:val="26"/>
-              </w:rPr>
-              <w:t>empresa1</w:t>
-            </w:r>
-            <w:r>
-              <w:rPr>
-                <w:sz w:val="26"/>
-                <w:szCs w:val="26"/>
-              </w:rPr>
-              <w:t xml:space="preserve">, localizada na </w:t>
-            </w:r>
-            <w:r>
-              <w:rPr>
-                <w:sz w:val="26"/>
-                <w:szCs w:val="26"/>
-              </w:rPr>
-              <w:t>endereço1.</w:t>
+              <w:t xml:space="preserve"> Projetta Engenharia Consultoria e Treinamentos LTDA</w:t>
+            </w:r>
+            <w:r>
+              <w:rPr>
+                <w:sz w:val="26"/>
+                <w:szCs w:val="26"/>
+              </w:rPr>
+              <w:t xml:space="preserve">, localizada </w:t>
+            </w:r>
+            <w:r>
+              <w:rPr>
+                <w:sz w:val="26"/>
+                <w:szCs w:val="26"/>
+              </w:rPr>
+              <w:t>Av. Sagrado Coração de Jesus, 550, Jd. Boa Vista, Guariba (SP).</w:t>
             </w:r>
           </w:p>
         </w:tc>
@@ -470,7 +486,14 @@
           <w:sz w:val="26"/>
           <w:szCs w:val="26"/>
         </w:rPr>
-        <w:t>cidade1, fim2.</w:t>
+        <w:t>Guariba (SP)</w:t>
+      </w:r>
+      <w:r>
+        <w:rPr>
+          <w:sz w:val="26"/>
+          <w:szCs w:val="26"/>
+        </w:rPr>
+        <w:t>, fim2.</w:t>
       </w:r>
     </w:p>
     <w:p>
@@ -650,7 +673,7 @@
                       <w:noProof/>
                     </w:rPr>
                     <w:drawing>
-                      <wp:anchor distT="0" distB="0" distL="114300" distR="114300" simplePos="0" relativeHeight="251660288" behindDoc="1" locked="0" layoutInCell="1" allowOverlap="0" wp14:anchorId="2192B196" wp14:editId="13B37BA5">
+                      <wp:anchor distT="0" distB="0" distL="114300" distR="114300" simplePos="0" relativeHeight="251660288" behindDoc="1" locked="0" layoutInCell="1" allowOverlap="0" wp14:anchorId="2192B196" wp14:editId="15AABE6B">
                         <wp:simplePos x="0" y="0"/>
                         <wp:positionH relativeFrom="column">
                           <wp:posOffset>-180975</wp:posOffset>

</xml_diff>